<commit_message>
fix(palestras): corrige título indevido no Prompt 0 do kit da Copel
Na fonte do Prompt 0, a quebra de linha deixava "## DADOS" no início de
uma linha, e o gerador convertia o trecho da instrução em título no .docx.
O texto passa a citar "## DADOS" entre aspas no meio da frase, nos dois
prompts, e os dois .docx são regenerados.

Co-Authored-By: Claude Opus 5.5 <noreply@anthropic.com>
Claude-Session: https://claude.ai/code/session_01LKavBbzuCsNGTvmY2ZGBcU
</commit_message>
<xml_diff>
--- a/pages/palestras/assets/copel/kit-ia-na-pratica/prompts/prompt-0-ingenuo.docx
+++ b/pages/palestras/assets/copel/kit-ia-na-pratica/prompts/prompt-0-ingenuo.docx
@@ -2,7 +2,7 @@
 <file path=word/document.xml><?xml version="1.0" encoding="utf-8"?>
 <w:document xmlns:w="http://schemas.openxmlformats.org/wordprocessingml/2006/main" xmlns:m="http://schemas.openxmlformats.org/officeDocument/2006/math" xmlns:r="http://schemas.openxmlformats.org/officeDocument/2006/relationships" xmlns:o="urn:schemas-microsoft-com:office:office" xmlns:v="urn:schemas-microsoft-com:vml" xmlns:w10="urn:schemas-microsoft-com:office:word" xmlns:a="http://schemas.openxmlformats.org/drawingml/2006/main" xmlns:pic="http://schemas.openxmlformats.org/drawingml/2006/picture" xmlns:wp="http://schemas.openxmlformats.org/drawingml/2006/wordprocessingDrawing">
   <w:body>
-    <w:bookmarkStart w:id="10" w:name="prompt-0-a-versão-ingênua"/>
+    <w:bookmarkStart w:id="9" w:name="prompt-0-a-versão-ingênua"/>
     <w:p>
       <w:pPr>
         <w:pStyle w:val="Heading1"/>
@@ -16,24 +16,7 @@
         <w:pStyle w:val="FirstParagraph"/>
       </w:pPr>
       <w:r>
-        <w:t xml:space="preserve">Use este prompt exatamente como está, em uma conversa nova, anexando três arquivos: a minuta (proposta-a-ia-perdas.docx), o relatório do benchmark (relatorio-benchmark-ia-distribuicao.docx) e a planilha de indicadores (indicadores-distribuidoras.xlsx). Se a ferramenta não aceitar anexos, copie o conteúdo dos arquivos e cole abaixo do prompt, depois de uma linha com o texto</w:t>
-      </w:r>
-    </w:p>
-    <w:bookmarkStart w:id="9" w:name="X4e01ac5c93e4856c1cb9e1ec1fc76c403106476"/>
-    <w:p>
-      <w:pPr>
-        <w:pStyle w:val="Heading2"/>
-      </w:pPr>
-      <w:r>
-        <w:t xml:space="preserve">DADOS. Desligue a busca na web e a memória entre conversas, ou use conversa</w:t>
-      </w:r>
-    </w:p>
-    <w:p>
-      <w:pPr>
-        <w:pStyle w:val="FirstParagraph"/>
-      </w:pPr>
-      <w:r>
-        <w:t xml:space="preserve">temporária, se a ferramenta oferecer essas opções. Este prompt serve de linha de base, e a saída dele será comparada com a do prompt estruturado.</w:t>
+        <w:t xml:space="preserve">Use este prompt exatamente como está, em uma conversa nova, anexando três arquivos: a minuta (proposta-a-ia-perdas.docx), o relatório do benchmark (relatorio-benchmark-ia-distribuicao.docx) e a planilha de indicadores (indicadores-distribuidoras.xlsx). Se a ferramenta não aceitar anexos, copie o conteúdo dos arquivos e cole abaixo do prompt, depois de uma linha com o texto "## DADOS". Desligue a busca na web e a memória entre conversas, ou use conversa temporária, se a ferramenta oferecer essas opções. Este prompt serve de linha de base, e a saída dele será comparada com a do prompt estruturado.</w:t>
       </w:r>
     </w:p>
     <w:p>
@@ -56,7 +39,6 @@
       </w:r>
     </w:p>
     <w:bookmarkEnd w:id="9"/>
-    <w:bookmarkEnd w:id="10"/>
     <w:sectPr>
       <w:footnotePr>
         <w:numRestart w:val="eachSect"/>

</xml_diff>